<commit_message>
Add work experience section, update resume
</commit_message>
<xml_diff>
--- a/public/Resume.docx
+++ b/public/Resume.docx
@@ -1103,6 +1103,289 @@
     </w:p>
     <w:p>
       <w:pPr>
+        <w:numPr>
+          <w:ilvl w:val="0"/>
+          <w:numId w:val="1"/>
+        </w:numPr>
+        <w:ind w:left="720"/>
+        <w:spacing w:before="20" w:after="20"/>
+      </w:pPr>
+      <w:r>
+        <w:rPr>
+          <w:rFonts w:ascii="Calibri"/>
+          <w:sz w:val="21"/>
+        </w:rPr>
+        <w:t>Supported high-volume production with ERP systems (SAP &amp; Oracle)</w:t>
+      </w:r>
+    </w:p>
+    <w:p>
+      <w:pPr>
+        <w:numPr>
+          <w:ilvl w:val="0"/>
+          <w:numId w:val="1"/>
+        </w:numPr>
+        <w:ind w:left="720"/>
+        <w:spacing w:before="20" w:after="20"/>
+      </w:pPr>
+      <w:r>
+        <w:rPr>
+          <w:rFonts w:ascii="Calibri"/>
+          <w:sz w:val="21"/>
+        </w:rPr>
+        <w:t>Expert in preventive maintenance, process improvement, and CGMP compliance</w:t>
+      </w:r>
+    </w:p>
+    <w:p>
+      <w:pPr>
+        <w:numPr>
+          <w:ilvl w:val="0"/>
+          <w:numId w:val="1"/>
+        </w:numPr>
+        <w:ind w:left="720"/>
+        <w:spacing w:before="20" w:after="20"/>
+      </w:pPr>
+      <w:r>
+        <w:rPr>
+          <w:rFonts w:ascii="Calibri"/>
+          <w:sz w:val="21"/>
+        </w:rPr>
+        <w:t>10 years maintaining and repairing advanced manufacturing equipment</w:t>
+      </w:r>
+    </w:p>
+    <w:p>
+      <w:pPr>
+        <w:spacing w:before="0" w:after="30"/>
+      </w:pPr>
+      <w:r>
+        <w:rPr>
+          <w:i/>
+          <w:color w:val="646464"/>
+          <w:rFonts w:ascii="Calibri"/>
+          <w:sz w:val="20"/>
+        </w:rPr>
+        <w:t>Cymer  |  Jan 2011 – Mar 2021</w:t>
+      </w:r>
+    </w:p>
+    <w:p>
+      <w:pPr>
+        <w:spacing w:before="140" w:after="10"/>
+      </w:pPr>
+      <w:r>
+        <w:rPr>
+          <w:b/>
+          <w:rFonts w:ascii="Calibri"/>
+          <w:sz w:val="22"/>
+        </w:rPr>
+        <w:t>Level 4 Technician</w:t>
+      </w:r>
+    </w:p>
+    <w:p>
+      <w:pPr>
+        <w:numPr>
+          <w:ilvl w:val="0"/>
+          <w:numId w:val="1"/>
+        </w:numPr>
+        <w:ind w:left="720"/>
+        <w:spacing w:before="20" w:after="20"/>
+      </w:pPr>
+      <w:r>
+        <w:rPr>
+          <w:rFonts w:ascii="Calibri"/>
+          <w:sz w:val="21"/>
+        </w:rPr>
+        <w:t>Applied root cause analysis to reduce equipment downtime</w:t>
+      </w:r>
+    </w:p>
+    <w:p>
+      <w:pPr>
+        <w:numPr>
+          <w:ilvl w:val="0"/>
+          <w:numId w:val="1"/>
+        </w:numPr>
+        <w:ind w:left="720"/>
+        <w:spacing w:before="20" w:after="20"/>
+      </w:pPr>
+      <w:r>
+        <w:rPr>
+          <w:rFonts w:ascii="Calibri"/>
+          <w:sz w:val="21"/>
+        </w:rPr>
+        <w:t>Maintained production equipment and supported manufacturing processes</w:t>
+      </w:r>
+    </w:p>
+    <w:p>
+      <w:pPr>
+        <w:spacing w:before="0" w:after="30"/>
+      </w:pPr>
+      <w:r>
+        <w:rPr>
+          <w:i/>
+          <w:color w:val="646464"/>
+          <w:rFonts w:ascii="Calibri"/>
+          <w:sz w:val="20"/>
+        </w:rPr>
+        <w:t>Singular Genomics  |  Nov 2021 – Apr 2022</w:t>
+      </w:r>
+    </w:p>
+    <w:p>
+      <w:pPr>
+        <w:spacing w:before="140" w:after="10"/>
+      </w:pPr>
+      <w:r>
+        <w:rPr>
+          <w:b/>
+          <w:rFonts w:ascii="Calibri"/>
+          <w:sz w:val="22"/>
+        </w:rPr>
+        <w:t>Senior Production Technician</w:t>
+      </w:r>
+    </w:p>
+    <w:p>
+      <w:pPr>
+        <w:numPr>
+          <w:ilvl w:val="0"/>
+          <w:numId w:val="1"/>
+        </w:numPr>
+        <w:ind w:left="720"/>
+        <w:spacing w:before="20" w:after="20"/>
+      </w:pPr>
+      <w:r>
+        <w:rPr>
+          <w:rFonts w:ascii="Calibri"/>
+          <w:sz w:val="21"/>
+        </w:rPr>
+        <w:t>Maintained quality control standards and technical documentation</w:t>
+      </w:r>
+    </w:p>
+    <w:p>
+      <w:pPr>
+        <w:numPr>
+          <w:ilvl w:val="0"/>
+          <w:numId w:val="1"/>
+        </w:numPr>
+        <w:ind w:left="720"/>
+        <w:spacing w:before="20" w:after="20"/>
+      </w:pPr>
+      <w:r>
+        <w:rPr>
+          <w:rFonts w:ascii="Calibri"/>
+          <w:sz w:val="21"/>
+        </w:rPr>
+        <w:t>Performed raw material blending, reactor operations, and laboratory testing</w:t>
+      </w:r>
+    </w:p>
+    <w:p>
+      <w:pPr>
+        <w:spacing w:before="0" w:after="30"/>
+      </w:pPr>
+      <w:r>
+        <w:rPr>
+          <w:i/>
+          <w:color w:val="646464"/>
+          <w:rFonts w:ascii="Calibri"/>
+          <w:sz w:val="20"/>
+        </w:rPr>
+        <w:t>Austin Elements Inc.  |  Dec 2022 – Aug 2023</w:t>
+      </w:r>
+    </w:p>
+    <w:p>
+      <w:pPr>
+        <w:spacing w:before="140" w:after="10"/>
+      </w:pPr>
+      <w:r>
+        <w:rPr>
+          <w:b/>
+          <w:rFonts w:ascii="Calibri"/>
+          <w:sz w:val="22"/>
+        </w:rPr>
+        <w:t>Laboratory Technician</w:t>
+      </w:r>
+    </w:p>
+    <w:p>
+      <w:pPr>
+        <w:numPr>
+          <w:ilvl w:val="0"/>
+          <w:numId w:val="1"/>
+        </w:numPr>
+        <w:ind w:left="720"/>
+        <w:spacing w:before="20" w:after="20"/>
+      </w:pPr>
+      <w:r>
+        <w:rPr>
+          <w:rFonts w:ascii="Calibri"/>
+          <w:sz w:val="21"/>
+        </w:rPr>
+        <w:t>Collaborated with engineering and production teams on process optimization</w:t>
+      </w:r>
+    </w:p>
+    <w:p>
+      <w:pPr>
+        <w:numPr>
+          <w:ilvl w:val="0"/>
+          <w:numId w:val="1"/>
+        </w:numPr>
+        <w:ind w:left="720"/>
+        <w:spacing w:before="20" w:after="20"/>
+      </w:pPr>
+      <w:r>
+        <w:rPr>
+          <w:rFonts w:ascii="Calibri"/>
+          <w:sz w:val="21"/>
+        </w:rPr>
+        <w:t>Improved manufacturing coating processes and resolved technical production issues</w:t>
+      </w:r>
+    </w:p>
+    <w:p>
+      <w:pPr>
+        <w:spacing w:before="0" w:after="30"/>
+      </w:pPr>
+      <w:r>
+        <w:rPr>
+          <w:i/>
+          <w:color w:val="646464"/>
+          <w:rFonts w:ascii="Calibri"/>
+          <w:sz w:val="20"/>
+        </w:rPr>
+        <w:t>Axalta Coating Systems  |  Mar 2024 – Feb 2026</w:t>
+      </w:r>
+    </w:p>
+    <w:p>
+      <w:pPr>
+        <w:spacing w:before="140" w:after="10"/>
+      </w:pPr>
+      <w:r>
+        <w:rPr>
+          <w:b/>
+          <w:rFonts w:ascii="Calibri"/>
+          <w:sz w:val="22"/>
+        </w:rPr>
+        <w:t>Technical Service Representative II</w:t>
+      </w:r>
+    </w:p>
+    <w:p>
+      <w:pPr>
+        <w:pBdr>
+          <w:bottom w:val="single" w:sz="6" w:space="1" w:color="AAAAAA"/>
+        </w:pBdr>
+        <w:spacing w:before="20" w:after="20"/>
+      </w:pPr>
+    </w:p>
+    <w:p>
+      <w:pPr>
+        <w:spacing w:before="200" w:after="60"/>
+      </w:pPr>
+      <w:r>
+        <w:rPr>
+          <w:rFonts w:ascii="Calibri"/>
+          <w:b/>
+          <w:color w:val="4682B4"/>
+          <w:sz w:val="20"/>
+        </w:rPr>
+        <w:t>PROFESSIONAL EXPERIENCE</w:t>
+      </w:r>
+    </w:p>
+    <w:p>
+      <w:pPr>
         <w:spacing w:before="280" w:after="80"/>
       </w:pPr>
       <w:r>

</xml_diff>